<commit_message>
Ajusta texto do CTA dos 6 Reels de administradoras/imobiliárias
CTA final mais direto e enxuto, conforme redação do Giuliano.

Co-Authored-By: Claude Sonnet 5 <noreply@anthropic.com>
Claude-Session: https://claude.ai/code/session_01GQSqEjEuqv44iBdACeUWUZ
</commit_message>
<xml_diff>
--- a/eleva/roteiros-reels-administradoras-imobiliarias-out2026-jan2027.docx
+++ b/eleva/roteiros-reels-administradoras-imobiliarias-out2026-jan2027.docx
@@ -244,7 +244,7 @@
           <w:sz w:val="20"/>
           <w:szCs w:val="20"/>
         </w:rPr>
-        <w:t xml:space="preserve">Comente SESSÃO que eu te explico os detalhes no direct. Numa sessão de uma hora, eu entendo o cenário e os gargalos do seu negócio, e te oriento se o caminho certo é um diagnóstico ou uma mentoria comigo. Se preferir, acesse pelo link da bio.</w:t>
+        <w:t xml:space="preserve">Comente SESSÃO que eu te explico no direct como agendar. Nessa sessão, eu entendo o cenário e os gargalos do seu negócio, e te oriento se o caminho é um diagnóstico ou uma mentoria comigo. Ou agende direto pelo link da bio.</w:t>
       </w:r>
     </w:p>
     <w:p>
@@ -278,7 +278,7 @@
           <w:sz w:val="20"/>
           <w:szCs w:val="20"/>
         </w:rPr>
-        <w:t xml:space="preserve">Comente "SESSÃO" que eu te explico os detalhes no direct. Numa sessão de uma hora, entendo o cenário do seu negócio e te oriento se o caminho é um diagnóstico ou uma mentoria comigo. Se preferir, acesse pelo link da bio.</w:t>
+        <w:t xml:space="preserve">Comente "SESSÃO" que eu te explico no direct como agendar. Nessa sessão, entendo o cenário do seu negócio e te oriento se o caminho é um diagnóstico ou uma mentoria comigo. Ou agende direto pelo link da bio.</w:t>
       </w:r>
     </w:p>
     <w:p>
@@ -493,7 +493,7 @@
           <w:sz w:val="21"/>
           <w:szCs w:val="21"/>
         </w:rPr>
-        <w:t xml:space="preserve">[CTA] Comente SESSÃO que eu te explico os detalhes no direct. Numa sessão de uma hora, eu entendo o cenário e os gargalos do seu negócio, e te oriento se o caminho certo é um diagnóstico ou uma mentoria comigo. Se preferir, acesse pelo link da bio.</w:t>
+        <w:t xml:space="preserve">[CTA] Comente SESSÃO que eu te explico no direct como agendar. Nessa sessão, eu entendo o cenário e os gargalos do seu negócio, e te oriento se o caminho é um diagnóstico ou uma mentoria comigo. Ou agende direto pelo link da bio.</w:t>
       </w:r>
     </w:p>
     <w:p>
@@ -556,7 +556,7 @@
           <w:sz w:val="21"/>
           <w:szCs w:val="21"/>
         </w:rPr>
-        <w:t xml:space="preserve">Comente "SESSÃO" que eu te explico os detalhes no direct. Numa sessão de uma hora, entendo o cenário do seu negócio e te oriento se o caminho é um diagnóstico ou uma mentoria comigo. Se preferir, acesse pelo link da bio.</w:t>
+        <w:t xml:space="preserve">Comente "SESSÃO" que eu te explico no direct como agendar. Nessa sessão, entendo o cenário do seu negócio e te oriento se o caminho é um diagnóstico ou uma mentoria comigo. Ou agende direto pelo link da bio.</w:t>
       </w:r>
     </w:p>
     <w:p>
@@ -681,7 +681,7 @@
           <w:sz w:val="21"/>
           <w:szCs w:val="21"/>
         </w:rPr>
-        <w:t xml:space="preserve">[CTA] Comente SESSÃO que eu te explico os detalhes no direct. Numa sessão de uma hora, eu entendo o cenário e os gargalos do seu negócio, e te oriento se o caminho certo é um diagnóstico ou uma mentoria comigo. Se preferir, acesse pelo link da bio.</w:t>
+        <w:t xml:space="preserve">[CTA] Comente SESSÃO que eu te explico no direct como agendar. Nessa sessão, eu entendo o cenário e os gargalos do seu negócio, e te oriento se o caminho é um diagnóstico ou uma mentoria comigo. Ou agende direto pelo link da bio.</w:t>
       </w:r>
     </w:p>
     <w:p>
@@ -744,7 +744,7 @@
           <w:sz w:val="21"/>
           <w:szCs w:val="21"/>
         </w:rPr>
-        <w:t xml:space="preserve">Comente "SESSÃO" que eu te explico os detalhes no direct. Numa sessão de uma hora, entendo o cenário do seu negócio e te oriento se o caminho é um diagnóstico ou uma mentoria comigo. Se preferir, acesse pelo link da bio.</w:t>
+        <w:t xml:space="preserve">Comente "SESSÃO" que eu te explico no direct como agendar. Nessa sessão, entendo o cenário do seu negócio e te oriento se o caminho é um diagnóstico ou uma mentoria comigo. Ou agende direto pelo link da bio.</w:t>
       </w:r>
     </w:p>
     <w:p>
@@ -869,7 +869,7 @@
           <w:sz w:val="21"/>
           <w:szCs w:val="21"/>
         </w:rPr>
-        <w:t xml:space="preserve">[CTA] Comente SESSÃO que eu te explico os detalhes no direct. Numa sessão de uma hora, eu entendo o cenário e os gargalos do seu negócio, e te oriento se o caminho certo é um diagnóstico ou uma mentoria comigo. Se preferir, acesse pelo link da bio.</w:t>
+        <w:t xml:space="preserve">[CTA] Comente SESSÃO que eu te explico no direct como agendar. Nessa sessão, eu entendo o cenário e os gargalos do seu negócio, e te oriento se o caminho é um diagnóstico ou uma mentoria comigo. Ou agende direto pelo link da bio.</w:t>
       </w:r>
     </w:p>
     <w:p>
@@ -932,7 +932,7 @@
           <w:sz w:val="21"/>
           <w:szCs w:val="21"/>
         </w:rPr>
-        <w:t xml:space="preserve">Comente "SESSÃO" que eu te explico os detalhes no direct. Numa sessão de uma hora, entendo o cenário do seu negócio e te oriento se o caminho é um diagnóstico ou uma mentoria comigo. Se preferir, acesse pelo link da bio.</w:t>
+        <w:t xml:space="preserve">Comente "SESSÃO" que eu te explico no direct como agendar. Nessa sessão, entendo o cenário do seu negócio e te oriento se o caminho é um diagnóstico ou uma mentoria comigo. Ou agende direto pelo link da bio.</w:t>
       </w:r>
     </w:p>
     <w:p>
@@ -1057,7 +1057,7 @@
           <w:sz w:val="21"/>
           <w:szCs w:val="21"/>
         </w:rPr>
-        <w:t xml:space="preserve">[CTA] Comente SESSÃO que eu te explico os detalhes no direct. Numa sessão de uma hora, eu entendo o cenário e os gargalos do seu negócio, e te oriento se o caminho certo é um diagnóstico ou uma mentoria comigo. Se preferir, acesse pelo link da bio.</w:t>
+        <w:t xml:space="preserve">[CTA] Comente SESSÃO que eu te explico no direct como agendar. Nessa sessão, eu entendo o cenário e os gargalos do seu negócio, e te oriento se o caminho é um diagnóstico ou uma mentoria comigo. Ou agende direto pelo link da bio.</w:t>
       </w:r>
     </w:p>
     <w:p>
@@ -1120,7 +1120,7 @@
           <w:sz w:val="21"/>
           <w:szCs w:val="21"/>
         </w:rPr>
-        <w:t xml:space="preserve">Comente "SESSÃO" que eu te explico os detalhes no direct. Numa sessão de uma hora, entendo o cenário do seu negócio e te oriento se o caminho é um diagnóstico ou uma mentoria comigo. Se preferir, acesse pelo link da bio.</w:t>
+        <w:t xml:space="preserve">Comente "SESSÃO" que eu te explico no direct como agendar. Nessa sessão, entendo o cenário do seu negócio e te oriento se o caminho é um diagnóstico ou uma mentoria comigo. Ou agende direto pelo link da bio.</w:t>
       </w:r>
     </w:p>
     <w:p>
@@ -1245,7 +1245,7 @@
           <w:sz w:val="21"/>
           <w:szCs w:val="21"/>
         </w:rPr>
-        <w:t xml:space="preserve">[CTA] Comente SESSÃO que eu te explico os detalhes no direct. Numa sessão de uma hora, eu entendo o cenário e os gargalos do seu negócio, e te oriento se o caminho certo é um diagnóstico ou uma mentoria comigo. Se preferir, acesse pelo link da bio.</w:t>
+        <w:t xml:space="preserve">[CTA] Comente SESSÃO que eu te explico no direct como agendar. Nessa sessão, eu entendo o cenário e os gargalos do seu negócio, e te oriento se o caminho é um diagnóstico ou uma mentoria comigo. Ou agende direto pelo link da bio.</w:t>
       </w:r>
     </w:p>
     <w:p>
@@ -1308,7 +1308,7 @@
           <w:sz w:val="21"/>
           <w:szCs w:val="21"/>
         </w:rPr>
-        <w:t xml:space="preserve">Comente "SESSÃO" que eu te explico os detalhes no direct. Numa sessão de uma hora, entendo o cenário do seu negócio e te oriento se o caminho é um diagnóstico ou uma mentoria comigo. Se preferir, acesse pelo link da bio.</w:t>
+        <w:t xml:space="preserve">Comente "SESSÃO" que eu te explico no direct como agendar. Nessa sessão, entendo o cenário do seu negócio e te oriento se o caminho é um diagnóstico ou uma mentoria comigo. Ou agende direto pelo link da bio.</w:t>
       </w:r>
     </w:p>
     <w:p>
@@ -1433,7 +1433,7 @@
           <w:sz w:val="21"/>
           <w:szCs w:val="21"/>
         </w:rPr>
-        <w:t xml:space="preserve">[CTA] Comente SESSÃO que eu te explico os detalhes no direct. Numa sessão de uma hora, eu entendo o cenário e os gargalos do seu negócio, e te oriento se o caminho certo é um diagnóstico ou uma mentoria comigo. Se preferir, acesse pelo link da bio.</w:t>
+        <w:t xml:space="preserve">[CTA] Comente SESSÃO que eu te explico no direct como agendar. Nessa sessão, eu entendo o cenário e os gargalos do seu negócio, e te oriento se o caminho é um diagnóstico ou uma mentoria comigo. Ou agende direto pelo link da bio.</w:t>
       </w:r>
     </w:p>
     <w:p>
@@ -1496,7 +1496,7 @@
           <w:sz w:val="21"/>
           <w:szCs w:val="21"/>
         </w:rPr>
-        <w:t xml:space="preserve">Comente "SESSÃO" que eu te explico os detalhes no direct. Numa sessão de uma hora, entendo o cenário do seu negócio e te oriento se o caminho é um diagnóstico ou uma mentoria comigo. Se preferir, acesse pelo link da bio.</w:t>
+        <w:t xml:space="preserve">Comente "SESSÃO" que eu te explico no direct como agendar. Nessa sessão, entendo o cenário do seu negócio e te oriento se o caminho é um diagnóstico ou uma mentoria comigo. Ou agende direto pelo link da bio.</w:t>
       </w:r>
     </w:p>
     <w:p>

</xml_diff>

<commit_message>
Ajusta CTA para "sessão estratégica" nos roteiros da Eleva
Substitui "nessa sessão" por "nessa sessão estratégica" para soar mais
natural, conforme pedido do Giuliano.

Co-Authored-By: Claude Sonnet 5 <noreply@anthropic.com>
Claude-Session: https://claude.ai/code/session_01GQSqEjEuqv44iBdACeUWUZ
</commit_message>
<xml_diff>
--- a/eleva/roteiros-reels-administradoras-imobiliarias-out2026-jan2027.docx
+++ b/eleva/roteiros-reels-administradoras-imobiliarias-out2026-jan2027.docx
@@ -244,7 +244,7 @@
           <w:sz w:val="20"/>
           <w:szCs w:val="20"/>
         </w:rPr>
-        <w:t xml:space="preserve">Comente SESSÃO que eu te explico no direct como agendar. Nessa sessão, eu entendo o cenário e os gargalos do seu negócio, e te oriento se o caminho é um diagnóstico ou uma mentoria comigo. Ou agende direto pelo link da bio.</w:t>
+        <w:t xml:space="preserve">Comente SESSÃO que eu te explico no direct como agendar. Nessa sessão estratégica, eu entendo o cenário e os gargalos do seu negócio, e te oriento se o caminho é um diagnóstico ou uma mentoria comigo. Ou agende direto pelo link da bio.</w:t>
       </w:r>
     </w:p>
     <w:p>
@@ -278,7 +278,7 @@
           <w:sz w:val="20"/>
           <w:szCs w:val="20"/>
         </w:rPr>
-        <w:t xml:space="preserve">Comente "SESSÃO" que eu te explico no direct como agendar. Nessa sessão, entendo o cenário do seu negócio e te oriento se o caminho é um diagnóstico ou uma mentoria comigo. Ou agende direto pelo link da bio.</w:t>
+        <w:t xml:space="preserve">Comente "SESSÃO" que eu te explico no direct como agendar. Nessa sessão estratégica, entendo o cenário do seu negócio e te oriento se o caminho é um diagnóstico ou uma mentoria comigo. Ou agende direto pelo link da bio.</w:t>
       </w:r>
     </w:p>
     <w:p>
@@ -493,7 +493,7 @@
           <w:sz w:val="21"/>
           <w:szCs w:val="21"/>
         </w:rPr>
-        <w:t xml:space="preserve">[CTA] Comente SESSÃO que eu te explico no direct como agendar. Nessa sessão, eu entendo o cenário e os gargalos do seu negócio, e te oriento se o caminho é um diagnóstico ou uma mentoria comigo. Ou agende direto pelo link da bio.</w:t>
+        <w:t xml:space="preserve">[CTA] Comente SESSÃO que eu te explico no direct como agendar. Nessa sessão estratégica, eu entendo o cenário e os gargalos do seu negócio, e te oriento se o caminho é um diagnóstico ou uma mentoria comigo. Ou agende direto pelo link da bio.</w:t>
       </w:r>
     </w:p>
     <w:p>
@@ -556,7 +556,7 @@
           <w:sz w:val="21"/>
           <w:szCs w:val="21"/>
         </w:rPr>
-        <w:t xml:space="preserve">Comente "SESSÃO" que eu te explico no direct como agendar. Nessa sessão, entendo o cenário do seu negócio e te oriento se o caminho é um diagnóstico ou uma mentoria comigo. Ou agende direto pelo link da bio.</w:t>
+        <w:t xml:space="preserve">Comente "SESSÃO" que eu te explico no direct como agendar. Nessa sessão estratégica, entendo o cenário do seu negócio e te oriento se o caminho é um diagnóstico ou uma mentoria comigo. Ou agende direto pelo link da bio.</w:t>
       </w:r>
     </w:p>
     <w:p>
@@ -681,7 +681,7 @@
           <w:sz w:val="21"/>
           <w:szCs w:val="21"/>
         </w:rPr>
-        <w:t xml:space="preserve">[CTA] Comente SESSÃO que eu te explico no direct como agendar. Nessa sessão, eu entendo o cenário e os gargalos do seu negócio, e te oriento se o caminho é um diagnóstico ou uma mentoria comigo. Ou agende direto pelo link da bio.</w:t>
+        <w:t xml:space="preserve">[CTA] Comente SESSÃO que eu te explico no direct como agendar. Nessa sessão estratégica, eu entendo o cenário e os gargalos do seu negócio, e te oriento se o caminho é um diagnóstico ou uma mentoria comigo. Ou agende direto pelo link da bio.</w:t>
       </w:r>
     </w:p>
     <w:p>
@@ -744,7 +744,7 @@
           <w:sz w:val="21"/>
           <w:szCs w:val="21"/>
         </w:rPr>
-        <w:t xml:space="preserve">Comente "SESSÃO" que eu te explico no direct como agendar. Nessa sessão, entendo o cenário do seu negócio e te oriento se o caminho é um diagnóstico ou uma mentoria comigo. Ou agende direto pelo link da bio.</w:t>
+        <w:t xml:space="preserve">Comente "SESSÃO" que eu te explico no direct como agendar. Nessa sessão estratégica, entendo o cenário do seu negócio e te oriento se o caminho é um diagnóstico ou uma mentoria comigo. Ou agende direto pelo link da bio.</w:t>
       </w:r>
     </w:p>
     <w:p>
@@ -869,7 +869,7 @@
           <w:sz w:val="21"/>
           <w:szCs w:val="21"/>
         </w:rPr>
-        <w:t xml:space="preserve">[CTA] Comente SESSÃO que eu te explico no direct como agendar. Nessa sessão, eu entendo o cenário e os gargalos do seu negócio, e te oriento se o caminho é um diagnóstico ou uma mentoria comigo. Ou agende direto pelo link da bio.</w:t>
+        <w:t xml:space="preserve">[CTA] Comente SESSÃO que eu te explico no direct como agendar. Nessa sessão estratégica, eu entendo o cenário e os gargalos do seu negócio, e te oriento se o caminho é um diagnóstico ou uma mentoria comigo. Ou agende direto pelo link da bio.</w:t>
       </w:r>
     </w:p>
     <w:p>
@@ -932,7 +932,7 @@
           <w:sz w:val="21"/>
           <w:szCs w:val="21"/>
         </w:rPr>
-        <w:t xml:space="preserve">Comente "SESSÃO" que eu te explico no direct como agendar. Nessa sessão, entendo o cenário do seu negócio e te oriento se o caminho é um diagnóstico ou uma mentoria comigo. Ou agende direto pelo link da bio.</w:t>
+        <w:t xml:space="preserve">Comente "SESSÃO" que eu te explico no direct como agendar. Nessa sessão estratégica, entendo o cenário do seu negócio e te oriento se o caminho é um diagnóstico ou uma mentoria comigo. Ou agende direto pelo link da bio.</w:t>
       </w:r>
     </w:p>
     <w:p>
@@ -1057,7 +1057,7 @@
           <w:sz w:val="21"/>
           <w:szCs w:val="21"/>
         </w:rPr>
-        <w:t xml:space="preserve">[CTA] Comente SESSÃO que eu te explico no direct como agendar. Nessa sessão, eu entendo o cenário e os gargalos do seu negócio, e te oriento se o caminho é um diagnóstico ou uma mentoria comigo. Ou agende direto pelo link da bio.</w:t>
+        <w:t xml:space="preserve">[CTA] Comente SESSÃO que eu te explico no direct como agendar. Nessa sessão estratégica, eu entendo o cenário e os gargalos do seu negócio, e te oriento se o caminho é um diagnóstico ou uma mentoria comigo. Ou agende direto pelo link da bio.</w:t>
       </w:r>
     </w:p>
     <w:p>
@@ -1120,7 +1120,7 @@
           <w:sz w:val="21"/>
           <w:szCs w:val="21"/>
         </w:rPr>
-        <w:t xml:space="preserve">Comente "SESSÃO" que eu te explico no direct como agendar. Nessa sessão, entendo o cenário do seu negócio e te oriento se o caminho é um diagnóstico ou uma mentoria comigo. Ou agende direto pelo link da bio.</w:t>
+        <w:t xml:space="preserve">Comente "SESSÃO" que eu te explico no direct como agendar. Nessa sessão estratégica, entendo o cenário do seu negócio e te oriento se o caminho é um diagnóstico ou uma mentoria comigo. Ou agende direto pelo link da bio.</w:t>
       </w:r>
     </w:p>
     <w:p>
@@ -1245,7 +1245,7 @@
           <w:sz w:val="21"/>
           <w:szCs w:val="21"/>
         </w:rPr>
-        <w:t xml:space="preserve">[CTA] Comente SESSÃO que eu te explico no direct como agendar. Nessa sessão, eu entendo o cenário e os gargalos do seu negócio, e te oriento se o caminho é um diagnóstico ou uma mentoria comigo. Ou agende direto pelo link da bio.</w:t>
+        <w:t xml:space="preserve">[CTA] Comente SESSÃO que eu te explico no direct como agendar. Nessa sessão estratégica, eu entendo o cenário e os gargalos do seu negócio, e te oriento se o caminho é um diagnóstico ou uma mentoria comigo. Ou agende direto pelo link da bio.</w:t>
       </w:r>
     </w:p>
     <w:p>
@@ -1308,7 +1308,7 @@
           <w:sz w:val="21"/>
           <w:szCs w:val="21"/>
         </w:rPr>
-        <w:t xml:space="preserve">Comente "SESSÃO" que eu te explico no direct como agendar. Nessa sessão, entendo o cenário do seu negócio e te oriento se o caminho é um diagnóstico ou uma mentoria comigo. Ou agende direto pelo link da bio.</w:t>
+        <w:t xml:space="preserve">Comente "SESSÃO" que eu te explico no direct como agendar. Nessa sessão estratégica, entendo o cenário do seu negócio e te oriento se o caminho é um diagnóstico ou uma mentoria comigo. Ou agende direto pelo link da bio.</w:t>
       </w:r>
     </w:p>
     <w:p>
@@ -1433,7 +1433,7 @@
           <w:sz w:val="21"/>
           <w:szCs w:val="21"/>
         </w:rPr>
-        <w:t xml:space="preserve">[CTA] Comente SESSÃO que eu te explico no direct como agendar. Nessa sessão, eu entendo o cenário e os gargalos do seu negócio, e te oriento se o caminho é um diagnóstico ou uma mentoria comigo. Ou agende direto pelo link da bio.</w:t>
+        <w:t xml:space="preserve">[CTA] Comente SESSÃO que eu te explico no direct como agendar. Nessa sessão estratégica, eu entendo o cenário e os gargalos do seu negócio, e te oriento se o caminho é um diagnóstico ou uma mentoria comigo. Ou agende direto pelo link da bio.</w:t>
       </w:r>
     </w:p>
     <w:p>
@@ -1496,7 +1496,7 @@
           <w:sz w:val="21"/>
           <w:szCs w:val="21"/>
         </w:rPr>
-        <w:t xml:space="preserve">Comente "SESSÃO" que eu te explico no direct como agendar. Nessa sessão, entendo o cenário do seu negócio e te oriento se o caminho é um diagnóstico ou uma mentoria comigo. Ou agende direto pelo link da bio.</w:t>
+        <w:t xml:space="preserve">Comente "SESSÃO" que eu te explico no direct como agendar. Nessa sessão estratégica, entendo o cenário do seu negócio e te oriento se o caminho é um diagnóstico ou uma mentoria comigo. Ou agende direto pelo link da bio.</w:t>
       </w:r>
     </w:p>
     <w:p>

</xml_diff>

<commit_message>
Gera versão final (docx/pdf) dos 6 roteiros com bloco de solução aprovado
Co-Authored-By: Claude Sonnet 5 <noreply@anthropic.com>
Claude-Session: https://claude.ai/code/session_01GQSqEjEuqv44iBdACeUWUZ
</commit_message>
<xml_diff>
--- a/eleva/roteiros-reels-administradoras-imobiliarias-out2026-jan2027.docx
+++ b/eleva/roteiros-reels-administradoras-imobiliarias-out2026-jan2027.docx
@@ -493,6 +493,18 @@
           <w:sz w:val="21"/>
           <w:szCs w:val="21"/>
         </w:rPr>
+        <w:t xml:space="preserve">[SOLUÇÃO] Já ajudei diversos executivos a descobrir esse número e a construir um plano pra multiplicá-lo. Também posso ajudar no seu negócio, através de uma sessão estratégica, um diagnóstico ou uma mentoria.</w:t>
+      </w:r>
+    </w:p>
+    <w:p>
+      <w:pPr>
+        <w:spacing w:after="160"/>
+      </w:pPr>
+      <w:r>
+        <w:rPr>
+          <w:sz w:val="21"/>
+          <w:szCs w:val="21"/>
+        </w:rPr>
         <w:t xml:space="preserve">[CTA] Comente SESSÃO que eu te explico no direct como agendar. Nessa sessão estratégica, eu entendo o cenário e os gargalos do seu negócio, e te oriento se o caminho é um diagnóstico ou uma mentoria comigo. Ou agende direto pelo link da bio.</w:t>
       </w:r>
     </w:p>
@@ -533,6 +545,18 @@
           <w:szCs w:val="21"/>
         </w:rPr>
         <w:t xml:space="preserve">Se a resposta for um chute baseado no faturamento, você está pensando na empresa como renda mensal — não como um patrimônio que se mede e se constrói. A pergunta certa não é "quanto vale hoje?". É "o que eu faço para que valha o dobro em três anos?".</w:t>
+      </w:r>
+    </w:p>
+    <w:p>
+      <w:pPr>
+        <w:spacing w:after="160"/>
+      </w:pPr>
+      <w:r>
+        <w:rPr>
+          <w:sz w:val="21"/>
+          <w:szCs w:val="21"/>
+        </w:rPr>
+        <w:t xml:space="preserve">Já ajudei diversos executivos a descobrir esse número e a construir um plano pra multiplicá-lo. Também posso ajudar no seu negócio, através de uma sessão estratégica, um diagnóstico ou uma mentoria.</w:t>
       </w:r>
     </w:p>
     <w:p>
@@ -681,6 +705,18 @@
           <w:sz w:val="21"/>
           <w:szCs w:val="21"/>
         </w:rPr>
+        <w:t xml:space="preserve">[SOLUÇÃO] Já ajudei vários executivos a identificar exatamente quais contratos estavam sangrando a operação e a corrigir isso. Também posso ajudar no seu negócio, através de uma sessão estratégica, um diagnóstico ou uma mentoria.</w:t>
+      </w:r>
+    </w:p>
+    <w:p>
+      <w:pPr>
+        <w:spacing w:after="160"/>
+      </w:pPr>
+      <w:r>
+        <w:rPr>
+          <w:sz w:val="21"/>
+          <w:szCs w:val="21"/>
+        </w:rPr>
         <w:t xml:space="preserve">[CTA] Comente SESSÃO que eu te explico no direct como agendar. Nessa sessão estratégica, eu entendo o cenário e os gargalos do seu negócio, e te oriento se o caminho é um diagnóstico ou uma mentoria comigo. Ou agende direto pelo link da bio.</w:t>
       </w:r>
     </w:p>
@@ -721,6 +757,18 @@
           <w:szCs w:val="21"/>
         </w:rPr>
         <w:t xml:space="preserve">A saída é decompor a margem por contrato, segmento e canal.</w:t>
+      </w:r>
+    </w:p>
+    <w:p>
+      <w:pPr>
+        <w:spacing w:after="160"/>
+      </w:pPr>
+      <w:r>
+        <w:rPr>
+          <w:sz w:val="21"/>
+          <w:szCs w:val="21"/>
+        </w:rPr>
+        <w:t xml:space="preserve">Já ajudei vários executivos a identificar exatamente quais contratos estavam sangrando a operação e a corrigir isso. Também posso ajudar no seu negócio, através de uma sessão estratégica, um diagnóstico ou uma mentoria.</w:t>
       </w:r>
     </w:p>
     <w:p>
@@ -869,6 +917,18 @@
           <w:sz w:val="21"/>
           <w:szCs w:val="21"/>
         </w:rPr>
+        <w:t xml:space="preserve">[SOLUÇÃO] Já conduzi esse tipo de diagnóstico para dezenas de executivos do setor. Também posso ajudar no seu negócio, através de uma sessão estratégica, um diagnóstico ou uma mentoria.</w:t>
+      </w:r>
+    </w:p>
+    <w:p>
+      <w:pPr>
+        <w:spacing w:after="160"/>
+      </w:pPr>
+      <w:r>
+        <w:rPr>
+          <w:sz w:val="21"/>
+          <w:szCs w:val="21"/>
+        </w:rPr>
         <w:t xml:space="preserve">[CTA] Comente SESSÃO que eu te explico no direct como agendar. Nessa sessão estratégica, eu entendo o cenário e os gargalos do seu negócio, e te oriento se o caminho é um diagnóstico ou uma mentoria comigo. Ou agende direto pelo link da bio.</w:t>
       </w:r>
     </w:p>
@@ -909,6 +969,18 @@
           <w:szCs w:val="21"/>
         </w:rPr>
         <w:t xml:space="preserve">Em quase todos os diagnósticos que eu conduzo, os mesmos pontos cegos aparecem: receita que fica na mesa, processos que dependem de pessoas específicas e decisões tomadas sem indicadores. Um olhar externo estruturado revela em semanas o que a rotina esconde há anos, e transforma essa clareza em prioridades e num plano de ação para a sua empresa.</w:t>
+      </w:r>
+    </w:p>
+    <w:p>
+      <w:pPr>
+        <w:spacing w:after="160"/>
+      </w:pPr>
+      <w:r>
+        <w:rPr>
+          <w:sz w:val="21"/>
+          <w:szCs w:val="21"/>
+        </w:rPr>
+        <w:t xml:space="preserve">Já conduzi esse tipo de diagnóstico para dezenas de executivos do setor. Também posso ajudar no seu negócio, através de uma sessão estratégica, um diagnóstico ou uma mentoria.</w:t>
       </w:r>
     </w:p>
     <w:p>
@@ -1057,6 +1129,18 @@
           <w:sz w:val="21"/>
           <w:szCs w:val="21"/>
         </w:rPr>
+        <w:t xml:space="preserve">[SOLUÇÃO] Já acompanhei diversos executivos nesse tipo de decisão, negociando compra, fusão ou venda sem ter certeza se era o melhor caminho. Também posso ajudar no seu negócio a tomar a decisão mais assertiva, através de uma sessão estratégica, um diagnóstico ou uma mentoria.</w:t>
+      </w:r>
+    </w:p>
+    <w:p>
+      <w:pPr>
+        <w:spacing w:after="160"/>
+      </w:pPr>
+      <w:r>
+        <w:rPr>
+          <w:sz w:val="21"/>
+          <w:szCs w:val="21"/>
+        </w:rPr>
         <w:t xml:space="preserve">[CTA] Comente SESSÃO que eu te explico no direct como agendar. Nessa sessão estratégica, eu entendo o cenário e os gargalos do seu negócio, e te oriento se o caminho é um diagnóstico ou uma mentoria comigo. Ou agende direto pelo link da bio.</w:t>
       </w:r>
     </w:p>
@@ -1097,6 +1181,18 @@
           <w:szCs w:val="21"/>
         </w:rPr>
         <w:t xml:space="preserve">Nesse cenário, os caminhos são compra, fusão ou venda. Escolhas legítimas; o risco está em não escolher e deixar que o mercado escolha por você. Quem escolhe com antecedência negocia em posição de força; quem é surpreendido costuma apenas aceitar. Definir a sua posição, avaliar a sua empresa e conduzir a operação com segurança é exatamente onde eu posso ajudar.</w:t>
+      </w:r>
+    </w:p>
+    <w:p>
+      <w:pPr>
+        <w:spacing w:after="160"/>
+      </w:pPr>
+      <w:r>
+        <w:rPr>
+          <w:sz w:val="21"/>
+          <w:szCs w:val="21"/>
+        </w:rPr>
+        <w:t xml:space="preserve">Já acompanhei diversos executivos nesse tipo de decisão, negociando compra, fusão ou venda sem ter certeza se era o melhor caminho. Também posso ajudar no seu negócio a tomar a decisão mais assertiva, através de uma sessão estratégica, um diagnóstico ou uma mentoria.</w:t>
       </w:r>
     </w:p>
     <w:p>
@@ -1245,6 +1341,18 @@
           <w:sz w:val="21"/>
           <w:szCs w:val="21"/>
         </w:rPr>
+        <w:t xml:space="preserve">[SOLUÇÃO] Já ajudei executivos a estruturar esse tipo de transição, seja sucessão, fusão ou expansão. Também posso ajudar no seu negócio, através de uma sessão estratégica, um diagnóstico ou uma mentoria.</w:t>
+      </w:r>
+    </w:p>
+    <w:p>
+      <w:pPr>
+        <w:spacing w:after="160"/>
+      </w:pPr>
+      <w:r>
+        <w:rPr>
+          <w:sz w:val="21"/>
+          <w:szCs w:val="21"/>
+        </w:rPr>
         <w:t xml:space="preserve">[CTA] Comente SESSÃO que eu te explico no direct como agendar. Nessa sessão estratégica, eu entendo o cenário e os gargalos do seu negócio, e te oriento se o caminho é um diagnóstico ou uma mentoria comigo. Ou agende direto pelo link da bio.</w:t>
       </w:r>
     </w:p>
@@ -1285,6 +1393,18 @@
           <w:szCs w:val="21"/>
         </w:rPr>
         <w:t xml:space="preserve">Mais cedo ou mais tarde, a empresa chega a essa encruzilhada: preparar a sucessão, avaliar uma fusão, seguir expandindo com uma gestão que não dependa de uma pessoa só, ou, se for a sua escolha, uma venda bem negociada. Preparadas com anos de antecedência, essas escolhas acontecem nos seus termos. Adiadas, acontecem nos termos do mercado. O que separa opção de pressão é o tempo de preparo, e um olhar externo e isento.</w:t>
+      </w:r>
+    </w:p>
+    <w:p>
+      <w:pPr>
+        <w:spacing w:after="160"/>
+      </w:pPr>
+      <w:r>
+        <w:rPr>
+          <w:sz w:val="21"/>
+          <w:szCs w:val="21"/>
+        </w:rPr>
+        <w:t xml:space="preserve">Já ajudei executivos a estruturar esse tipo de transição, seja sucessão, fusão ou expansão. Também posso ajudar no seu negócio, através de uma sessão estratégica, um diagnóstico ou uma mentoria.</w:t>
       </w:r>
     </w:p>
     <w:p>
@@ -1433,6 +1553,18 @@
           <w:sz w:val="21"/>
           <w:szCs w:val="21"/>
         </w:rPr>
+        <w:t xml:space="preserve">[SOLUÇÃO] Já ajudei diversos executivos a desenhar esse tipo de expansão com método antes de executar. Também posso ajudar no seu negócio, através de uma sessão estratégica, um diagnóstico ou uma mentoria.</w:t>
+      </w:r>
+    </w:p>
+    <w:p>
+      <w:pPr>
+        <w:spacing w:after="160"/>
+      </w:pPr>
+      <w:r>
+        <w:rPr>
+          <w:sz w:val="21"/>
+          <w:szCs w:val="21"/>
+        </w:rPr>
         <w:t xml:space="preserve">[CTA] Comente SESSÃO que eu te explico no direct como agendar. Nessa sessão estratégica, eu entendo o cenário e os gargalos do seu negócio, e te oriento se o caminho é um diagnóstico ou uma mentoria comigo. Ou agende direto pelo link da bio.</w:t>
       </w:r>
     </w:p>
@@ -1473,6 +1605,18 @@
           <w:szCs w:val="21"/>
         </w:rPr>
         <w:t xml:space="preserve">Expansão tem mais de um caminho: uma nova praça, uma nova vertical de serviços, uma aquisição. A que dá errado quase nunca falha na ambição; falha no preparo — o caminho errado, no momento errado, com a operação de origem ainda frágil. Expansão se desenha antes de se executar: direção, modelo, equipe e capital, nessa ordem.</w:t>
+      </w:r>
+    </w:p>
+    <w:p>
+      <w:pPr>
+        <w:spacing w:after="160"/>
+      </w:pPr>
+      <w:r>
+        <w:rPr>
+          <w:sz w:val="21"/>
+          <w:szCs w:val="21"/>
+        </w:rPr>
+        <w:t xml:space="preserve">Já ajudei diversos executivos a desenhar esse tipo de expansão com método antes de executar. Também posso ajudar no seu negócio, através de uma sessão estratégica, um diagnóstico ou uma mentoria.</w:t>
       </w:r>
     </w:p>
     <w:p>

</xml_diff>